<commit_message>
WC/2024/227: cut Registry letter to the ask (change 65); drift-checked, election and 9A unchanged
Co-Authored-By: Claude Opus 5.5 <noreply@anthropic.com>
Claude-Session: https://claude.ai/code/session_01PbSZiMB1koFR46V5hQyVcy
</commit_message>
<xml_diff>
--- a/wc2024227/drafts/out/FILING_1OCT2026/2026-10_LETTER_to_Registry_FINAL.docx
+++ b/wc2024227/drafts/out/FILING_1OCT2026/2026-10_LETTER_to_Registry_FINAL.docx
@@ -153,7 +153,7 @@
           <w:sz w:val="19"/>
           <w:szCs w:val="19"/>
         </w:rPr>
-        <w:t xml:space="preserve">The application, and what the amendment does. </w:t>
+        <w:t xml:space="preserve">The application. </w:t>
       </w:r>
       <w:r>
         <w:rPr>
@@ -162,57 +162,7 @@
           <w:sz w:val="19"/>
           <w:szCs w:val="19"/>
         </w:rPr>
-        <w:t>The Appellant applies for leave to file and serve the enclosed Second Amended Statement of Facts and Contentions (Form 9A), under the Commission's power to give directions (Industrial Relations Act 2016, section 451(2)). A copy goes to the Respondent with this letter, and its consent is sought. The amendment is sought because the matter has become much clearer since the Amended Form 9A of 7 April 2026. The Respondent has admitted 298 of the 303 facts in the Appellant's notice of 28 August 2026. It has admitted, or has since confirmed, 29 of the 39 documents behind them. The Second Amended Form 9A accepts that the onus of proof is on the Appellant, withdraws the descriptions of conduct used in the earlier pleading, identifies the admissions supporting each stressor and distinguishes them from the other documents and the Appellant's own evidence, states the contentions and the questions for decision on that footing, and adds no new stressor or allegation; its further particulars are drawn from the admitted facts and the documents identified in the schedule. No hearing date has been set, so the amendment is sought before the matter is listed and before either party prepares for hearing on the earlier pleading. The Appellant does not oppose the Respondent having time to amend its own statement of facts and contentions if it wishes. The pleading sets out the admitted facts under the stressor each one supports, with the paragraph number of the admission against each, so that the whole case can be read in one document. The three stressors are retained, with dated lettered particulars; the list of stressors follows Part 4.8 of the Appeal Guide, and Part 3 of the schedule indexes the particulars. Duties, standards, medical links and the Respondent's pleaded explanations are unlettered. Each theme and its particulars can be understood independently; where a fact matters to more than one stressor it is repeated, and the pleading says so. The schedule to this letter lists the documents relied on, other than the treating medical records served on 9 September 2026, and their status.</w:t>
-      </w:r>
-      <w:r>
-        <w:rPr>
-          <w:rStyle w:val="CommentReference"/>
-        </w:rPr>
-      </w:r>
-    </w:p>
-    <w:p>
-      <w:pPr>
-        <w:spacing w:before="0" w:after="80" w:line="264" w:lineRule="auto"/>
-      </w:pPr>
-      <w:r>
-        <w:rPr>
-          <w:rFonts w:ascii="Arial" w:hAnsi="Arial" w:cs="Arial"/>
-          <w:b/>
-          <w:sz w:val="19"/>
-          <w:szCs w:val="19"/>
-        </w:rPr>
-        <w:t xml:space="preserve">The matter, in summary. </w:t>
-      </w:r>
-      <w:r>
-        <w:rPr>
-          <w:rFonts w:ascii="Arial" w:hAnsi="Arial" w:cs="Arial"/>
-          <w:b w:val="0"/>
-          <w:sz w:val="19"/>
-          <w:szCs w:val="19"/>
-        </w:rPr>
-        <w:t>The Appellant was an Administration Officer (AO3) on the Logan Hospital Switchboard, a continuous 24/7 role whose function the Respondent admits is critical to patient safety (2, 13, 289). Stressor 1: from July 2023 database access was removed and not restored (40, 55); process changes were made effective the day they were notified, with no listed record of consultation (51, 181, 273); calls were misdirected and the directory was not corrected (56 to 69, 89 to 110); fixed office hours were not stated for approximately nine months (71 to 73); and the Appellant's written request for them was met with a request to retract (74 to 77). Stressor 2: pay was wrong in four fortnights (185 to 189); Payroll's direction of 3 May 2024 was not actioned at 13 May (193), was still awaited on 21 May (195), and was lodged on 28 May and recorded "Part Completed" (203); a paid leave request was declined twice, with the Respondent acknowledging that attachments were present at the later decline (116, 118, 134). Stressor 3: a seven-hour break was rostered between 17 and 18 March 2024 (284) against a minimum of ten hours, or eight by written agreement (285), an agreement whose application is disputed by reference to the later Human Resources email, with no swap alleged (225, 234); the fatigue enquiry was answered after 23 days with a refusal (247, 249); the employer states that fatigue risk management assessment was implemented after 30 June 2024, to be read with the May risk-matrix discussion (264, 269 to 271); and the Respondent's own review found the rostering was unreasonable management action (260) and employment a significant contributing factor (262).</w:t>
-      </w:r>
-    </w:p>
-    <w:p>
-      <w:pPr>
-        <w:spacing w:before="0" w:after="80" w:line="264" w:lineRule="auto"/>
-      </w:pPr>
-      <w:r>
-        <w:rPr>
-          <w:rFonts w:ascii="Arial" w:hAnsi="Arial" w:cs="Arial"/>
-          <w:b/>
-          <w:sz w:val="19"/>
-          <w:szCs w:val="19"/>
-        </w:rPr>
-        <w:t xml:space="preserve">The Respondent's evidence. </w:t>
-      </w:r>
-      <w:r>
-        <w:rPr>
-          <w:rFonts w:ascii="Arial" w:hAnsi="Arial" w:cs="Arial"/>
-          <w:sz w:val="19"/>
-          <w:szCs w:val="19"/>
-        </w:rPr>
-        <w:t>Directions 3 and 4 of the Further Directions Order (3) required the Respondent's list of witnesses, its outlines of evidence and any expert reports that will be relied upon by 4.00 pm on 30 September 2026. On 24 September 2026 it sent its list to the Registry for filing, naming four witnesses, Ms Taylor, Ms Reese, Ms Wright and Ms Earl, described as "lay" witnesses, and served outlines of their evidence. The Respondent's amended statement of facts and contentions of 13 May 2026 does not admit the pleaded onset and diagnosis of the injury, saying these are "matters for determination by the Commission at a hearing" (paragraph 9), and identifies no expert evidence. Its response of 8 September 2026 to the notices to admit names no medical or expert witness, and the documents listed under the headings "Medical Certificates" and "Medical" in its amended List of Documents of 14 August 2026 are those of the treating practitioners (items 7 to 11).</w:t>
+        <w:t xml:space="preserve">The Appellant was an Administration Officer on the Logan Hospital Switchboard; the Respondent admits that maintaining accurate contact details for medical staff is a critical function of the Switchboard to ensure effective clinical handover and patient safety (fact 289). The Appellant applies for leave to file and serve the enclosed Second Amended Statement of Facts and Contentions (Form 9A), under section 451(2) of the Industrial Relations Act 2016. A copy goes to the Respondent with this letter, and its consent is sought. Since the Amended Form 9A of 7 April 2026, the Respondent has admitted 298 of the 303 facts in the Appellant's notice of 28 August 2026, and has admitted or since confirmed 29 of the 39 documents behind them. The amendment accepts that the onus of proof is on the Appellant, withdraws the descriptions of conduct used in the earlier pleading, and adds no new stressor or allegation. No hearing date has been set, so the amendment is sought before either party prepares for hearing on the earlier pleading. The Appellant does not oppose the Respondent having time to amend its own statement of facts and contentions.</w:t>
       </w:r>
     </w:p>
     <w:p>
@@ -234,7 +184,7 @@
           <w:sz w:val="19"/>
           <w:szCs w:val="19"/>
         </w:rPr>
-        <w:t xml:space="preserve">(1) Its review decision of 24 October 2024 found that the Appellant sustained a personal injury of a psychological nature, arising out of employment to the extent it arose out of factors 2, 3 and 4, where employment was a significant contributing factor (facts 261 and 262); the claim was rejected under section 32(5). (2) Paragraph 27 of its amended statement of facts and contentions, which contends that any management action was reasonable management action taken in a reasonable way, does not identify the management action relied upon; that was admitted on 8 September 2026 (fact 303). (3) It has named no medical or expert witness and served no expert report. (4) Its outlines of evidence state that the seven-hour break of 17 to 18 March 2024 was "the result of human error" and, on the advice returned within payroll, "a rostering practice issue for the line manager"; and that the second decline of the paid Special Pandemic Leave request "appears to have been made in error". The Appellant asks that, at the opening of the conference, the Respondent be asked to state its position on paragraph 27 in light of those matters: whether it maintains it, will particularise it, or seeks time (items 2 and 5 of the election).</w:t>
+        <w:t xml:space="preserve">(1) Its review decision of 24 October 2024 found that the Appellant sustained a personal injury of a psychological nature, arising out of employment to the extent it arose out of factors 2, 3 and 4, where employment was a significant contributing factor (facts 261 and 262); the claim was rejected under section 32(5). (2) Paragraph 27 of its amended statement of facts and contentions, which contends that any management action was reasonable management action taken in a reasonable way, does not identify the management action relied upon; that was admitted on 8 September 2026 (fact 303). (3) It has named no medical or expert witness and served no expert report: its list of 24 September 2026 names four witnesses, Ms Taylor, Ms Reese, Ms Wright and Ms Earl, described as "lay" witnesses, and it served outlines of their evidence. (4) Its outlines of evidence state that the seven-hour break of 17 to 18 March 2024 was "the result of human error" and, on the advice returned within payroll, "a rostering practice issue for the line manager"; and that the second decline of the paid Special Pandemic Leave request "appears to have been made in error". The Appellant asks that, at the opening of the conference, the Respondent be asked to state its position on paragraph 27 in light of those matters: whether it maintains it, will particularise it, or seeks time (items 2 and 5 of the election).</w:t>
       </w:r>
     </w:p>
     <w:p>
@@ -256,29 +206,7 @@
           <w:sz w:val="19"/>
           <w:szCs w:val="19"/>
         </w:rPr>
-        <w:t>The notice to admit facts (303 facts), the notice to admit documents (39 documents at Annexure A) and the Respondent's responses of 8 September 2026 were served between the parties and are not on the Commission's file. They, and the documents themselves, are available to the Commission on request. If the Commission wishes to consider them with the enclosure, the Appellant will file them in the form the Registry directs, together with the four documents the Respondent confirmed on 23 September 2026. The Appellant will proceed on whatever orders and directions the Commissioner gives on this application, on the documents, and on the further conduct of the appeal.</w:t>
-      </w:r>
-    </w:p>
-    <w:p>
-      <w:pPr>
-        <w:spacing w:before="0" w:after="80" w:line="264" w:lineRule="auto"/>
-      </w:pPr>
-      <w:r>
-        <w:rPr>
-          <w:rFonts w:ascii="Arial" w:hAnsi="Arial" w:cs="Arial"/>
-          <w:b/>
-          <w:sz w:val="19"/>
-          <w:szCs w:val="19"/>
-        </w:rPr>
-        <w:t xml:space="preserve">Where the Appellant stands. </w:t>
-      </w:r>
-      <w:r>
-        <w:rPr>
-          <w:rFonts w:ascii="Arial" w:hAnsi="Arial" w:cs="Arial"/>
-          <w:sz w:val="19"/>
-          <w:szCs w:val="19"/>
-        </w:rPr>
-        <w:t>The Appellant relies on the admitted facts, the documents in the schedule to this letter, the treating medical records served on 9 September 2026, and the oral evidence of his treating general practitioner and psychiatrist. No medico-legal report is relied on. His list of witnesses filed, and his outlines of evidence served, on 9 September 2026 under directions 1 and 2 are not changed by the amendment. He seeks the orders in Part E.</w:t>
+        <w:t>The notice to admit facts (303 facts), the notice to admit documents (39 documents at Annexure A) and the Respondent's responses of 8 September 2026 were served between the parties and are not on the Commission's file. They, and the documents themselves, are available to the Commission on request. If the Commission wishes to consider them with the enclosure, the Appellant will file them in the form the Registry directs, together with the four documents the Respondent confirmed on 23 September 2026.</w:t>
       </w:r>
     </w:p>
     <w:p>
@@ -6528,7 +6456,7 @@
           <w:sz w:val="19"/>
           <w:szCs w:val="19"/>
         </w:rPr>
-        <w:t>The Appellant asked the Respondent on 9 September 2026 to confirm the ten outstanding documents. The Respondent's email of 23 September 2026 gives no date by which the copies are expected, and does not refer to Tab 24, which is a Together Queensland document, not a Metro South Health document. The nine documents the Respondent referred to Metro South Health are Metro South Health documents. The copies of Tabs 1, 5, 17 to 19, 21 to 24 and 31 came from the Appellant's own records; Tabs 17 to 19, 22 and 23 bear the signature of the employer's Director, Corporate Services. If Metro South produces the same documents to the Respondent, and the Respondent discloses them back to the Appellant, he will receive documents he already holds.</w:t>
+        <w:t>The Appellant asked the Respondent on 9 September 2026 to confirm the ten outstanding documents; the Respondent's email of 23 September 2026 gives no date by which the copies are expected. The copies of Tabs 1, 5, 17 to 19, 21 to 24 and 31 came from the Appellant's own records; Tabs 17 to 19, 22 and 23 bear the signature of the employer's Director, Corporate Services. Tab 24 is a Together Queensland document, which the email of 23 September 2026 does not address.</w:t>
       </w:r>
     </w:p>
     <w:p>

</xml_diff>

<commit_message>
WC/2024/227: nested stressor list, causal v record, orders, costs of the hearing, authenticity direction (change 68)
Co-Authored-By: Claude Opus 5.5 <noreply@anthropic.com>
Claude-Session: https://claude.ai/code/session_01PbSZiMB1koFR46V5hQyVcy
</commit_message>
<xml_diff>
--- a/wc2024227/drafts/out/FILING_1OCT2026/2026-10_LETTER_to_Registry_FINAL.docx
+++ b/wc2024227/drafts/out/FILING_1OCT2026/2026-10_LETTER_to_Registry_FINAL.docx
@@ -162,7 +162,7 @@
           <w:sz w:val="19"/>
           <w:szCs w:val="19"/>
         </w:rPr>
-        <w:t xml:space="preserve">The Appellant was an Administration Officer on the Logan Hospital Switchboard; the Respondent admits that maintaining accurate contact details for medical staff is a critical function of the Switchboard to ensure effective clinical handover and patient safety (fact 289). The Appellant applies for leave to file and serve the enclosed Second Amended Statement of Facts and Contentions (Form 9A), under section 451(2) of the Industrial Relations Act 2016. A copy goes to the Respondent with this letter, and its consent is sought. Since the Amended Form 9A of 7 April 2026, the Respondent has admitted 298 of the 303 facts in the Appellant's notice of 28 August 2026, and has admitted or since confirmed 29 of the 39 documents behind them. The amendment accepts that the onus of proof is on the Appellant, withdraws the descriptions of conduct used in the earlier pleading, and adds no new stressor or allegation. No hearing date has been set, so the amendment is sought before either party prepares for hearing on the earlier pleading. The Appellant does not oppose the Respondent having time to amend its own statement of facts and contentions.</w:t>
+        <w:t xml:space="preserve">The Appellant was an Administration Officer on the Logan Hospital Switchboard; the Respondent admits that maintaining accurate contact details for medical staff is a critical function of the Switchboard to ensure effective clinical handover and patient safety (fact 289). The Appellant applies for leave to file and serve the enclosed Second Amended Statement of Facts and Contentions (Form 9A), under section 451(2) of the Industrial Relations Act 2016. A copy goes to the Respondent with this letter, and its consent is sought. Since the Amended Form 9A of 7 April 2026, the Respondent has admitted, to the extent recorded in its response of 8 September 2026, 298 of the 303 facts in the Appellant's notice of 28 August 2026, and has admitted or since confirmed 29 of the 39 documents behind them. The amendment accepts that the onus of proof is on the Appellant, withdraws the descriptions of conduct used in the earlier pleading, and adds no new stressor or allegation. No hearing date has been set, so the amendment is sought before either party prepares for hearing on the earlier pleading. The Appellant does not oppose the Respondent having time to amend its own statement of facts and contentions.</w:t>
       </w:r>
     </w:p>
     <w:p>
@@ -184,7 +184,7 @@
           <w:sz w:val="19"/>
           <w:szCs w:val="19"/>
         </w:rPr>
-        <w:t xml:space="preserve">(1) Its review decision of 24 October 2024 found that the Appellant sustained a personal injury of a psychological nature, arising out of employment to the extent it arose out of factors 2, 3 and 4, where employment was a significant contributing factor (facts 261 and 262); the claim was rejected under section 32(5). (2) Paragraph 27 of its amended statement of facts and contentions, which contends that any management action was reasonable management action taken in a reasonable way, does not identify the management action relied upon; that was admitted on 8 September 2026 (fact 303). (3) It has named no medical or expert witness and served no expert report: its list of 24 September 2026 names four witnesses, Ms Taylor, Ms Reese, Ms Wright and Ms Earl, described as "lay" witnesses, and it served outlines of their evidence. (4) Its outlines of evidence state that the seven-hour break of 17 to 18 March 2024 was "the result of human error" and, on the advice returned within payroll, "a rostering practice issue for the line manager"; and that the second decline of the paid Special Pandemic Leave request "appears to have been made in error". The Appellant asks that, at the opening of the conference, the Respondent be asked to state its position on paragraph 27 in light of those matters: whether it maintains it, will particularise it, or seeks time (items 2 and 5 of the election).</w:t>
+        <w:t xml:space="preserve">(1) Its review decision of 24 October 2024 found that the Appellant sustained a personal injury of a psychological nature, arising out of employment to the extent it arose out of factors 2, 3 and 4, where employment was a significant contributing factor (facts 261 and 262); the claim was rejected under section 32(5). (2) Paragraph 27 of its amended statement of facts and contentions, which contends that any management action was reasonable management action taken in a reasonable way, does not identify the management action relied upon; that was admitted on 8 September 2026 (fact 303). That admission concerns paragraph 27; it does not dispose of the more specific explanations pleaded elsewhere in the Respondent's statement. (3) It has named no medical or expert witness and served no expert report: its list of 24 September 2026 names four witnesses, Ms Taylor, Ms Reese, Ms Wright and Ms Earl, described as "lay" witnesses, and it served outlines of their evidence. (4) Its outlines of evidence state that the seven-hour break of 17 to 18 March 2024 was "the result of human error" and, on the advice returned within payroll, "a rostering practice issue for the line manager"; and that the second decline of the paid Special Pandemic Leave request "appears to have been made in error". The Appellant asks that, at the opening of the conference, the Respondent be asked to state its position on paragraph 27 in light of those matters: whether it maintains it, will particularise it, or seeks time (items 2 and 5 of the election).</w:t>
       </w:r>
     </w:p>
     <w:p>
@@ -228,7 +228,7 @@
           <w:sz w:val="19"/>
           <w:szCs w:val="19"/>
         </w:rPr>
-        <w:t>Part 1 of the schedule on the following pages states the status of each of the 39 documents at Annexure A to the notices of 28 August 2026; Part 2 lists the other documents the pleading relies on; Part 3 indexes the dated particulars of the Second Amended Form 9A and adds no stressor. The Appellant asks that the Respondent be directed to state, by a date the Commission fixes, whether it disputes the authenticity of each of the ten outstanding documents and on what ground; and that, if it does not, they be taken to be authentic and received at hearing.</w:t>
+        <w:t xml:space="preserve">Part 1 of the schedule on the following pages states the status of each of the 39 documents at Annexure A to the notices of 28 August 2026; Part 2 lists the other documents the pleading relies on; Part 3 indexes the dated particulars of the Second Amended Form 9A and adds no stressor. The Appellant asks that the Respondent be directed to state, by a date the Commission fixes, whether it maintains its dispute as to the authenticity of each of the ten outstanding documents and, if so, on what ground; that any dispute not so maintained cease to be in issue, so that the document is taken to be authentic for the hearing, without affecting any question of relevance or weight; or that the Commission make such other order about authenticity as it considers appropriate.</w:t>
       </w:r>
     </w:p>
     <w:p>
@@ -7340,7 +7340,7 @@
           <w:sz w:val="19"/>
           <w:szCs w:val="19"/>
         </w:rPr>
-        <w:t xml:space="preserve">The three stressors are pleaded, with their particulars, in the Second Amended Form 9A; this index adds no stressor or particular. The causal particulars are 1(b), 1(d), 1(f) to 1(h), 1(k) and 1(l); 2(a) to 2(i) and 2(l) to 2(n); and 3(b) to 3(h). The others, 1(a), 1(c), 1(e), 1(i), 1(j), 2(j), 2(k), 2(o) and 3(a), are context and are not relied on as separate causes.</w:t>
+        <w:t xml:space="preserve">The three stressors are pleaded, with their particulars, in the Second Amended Form 9A; this index adds no stressor or particular. The causal particulars are 1(b), 1(d), 1(f) to 1(h), 1(k) and 1(l); 2(a) to 2(i), 2(l) and 2(m); and 3(b) to 3(f); they are also listed, with their dates and descriptions, under each stressor in the list of stressors in the Second Amended Form 9A. Particulars 1(a), 1(c), 1(e), 1(i), 1(j), 2(j) and 3(a) are context. Particulars 2(k), 2(n), 2(o), 3(g) and 3(h) are the record of how the matters were handled and when the corrections were made; they are relied on as proof, not as separate causes.</w:t>
       </w:r>
     </w:p>
     <w:tbl>
@@ -9823,7 +9823,7 @@
                 <w:color w:val="000000"/>
                 <w:sz w:val="18"/>
               </w:rPr>
-              <w:t>The Director followed up with HR and attached the fatigue guideline; related context.</w:t>
+              <w:t xml:space="preserve">The Director followed up with HR and attached the fatigue guideline; record only.</w:t>
             </w:r>
           </w:p>
         </w:tc>
@@ -10132,7 +10132,7 @@
                 <w:color w:val="000000"/>
                 <w:sz w:val="18"/>
               </w:rPr>
-              <w:t>Payroll identified adjustments for 28 February, 30 March and 1 April.</w:t>
+              <w:t xml:space="preserve">Payroll identified adjustments for 28 February, 30 March and 1 April; record of when corrected.</w:t>
             </w:r>
           </w:p>
         </w:tc>
@@ -10235,7 +10235,7 @@
                 <w:color w:val="000000"/>
                 <w:sz w:val="18"/>
               </w:rPr>
-              <w:t>Payroll identified a later amendment and pay date; evidence of the earlier correction history.</w:t>
+              <w:t xml:space="preserve">Payroll identified a later amendment and pay date; record of when corrected.</w:t>
             </w:r>
           </w:p>
         </w:tc>
@@ -10956,7 +10956,7 @@
                 <w:color w:val="000000"/>
                 <w:sz w:val="18"/>
               </w:rPr>
-              <w:t>The Director recorded his fatigue concerns, a moderate rating and an undisclosed roster decision.</w:t>
+              <w:t xml:space="preserve">The Director recorded his fatigue concerns, a moderate rating and an undisclosed roster decision; internal record.</w:t>
             </w:r>
           </w:p>
         </w:tc>
@@ -11059,7 +11059,7 @@
                 <w:color w:val="000000"/>
                 <w:sz w:val="18"/>
               </w:rPr>
-              <w:t>The Director followed up her earlier query and attached the guideline.</w:t>
+              <w:t xml:space="preserve">The Director followed up her earlier query and attached the guideline; internal record.</w:t>
             </w:r>
           </w:p>
         </w:tc>

</xml_diff>

<commit_message>
WC/2024/227: final set - proposed 9A for consideration; operating conditions (calls, codes, complaints) in Stressor 1 (change 72)
Co-Authored-By: Claude Opus 5.5 <noreply@anthropic.com>
Claude-Session: https://claude.ai/code/session_01PbSZiMB1koFR46V5hQyVcy
</commit_message>
<xml_diff>
--- a/wc2024227/drafts/out/FILING_1OCT2026/2026-10_LETTER_to_Registry_FINAL.docx
+++ b/wc2024227/drafts/out/FILING_1OCT2026/2026-10_LETTER_to_Registry_FINAL.docx
@@ -117,7 +117,7 @@
           <w:sz w:val="19"/>
           <w:szCs w:val="19"/>
         </w:rPr>
-        <w:t>Direction 5 election; application for leave to file a Second Amended Statement of Facts and Contentions (Form 9A); status of the documents</w:t>
+        <w:t xml:space="preserve">Direction 5 election; application for leave to file a proposed Second Amended Statement of Facts and Contentions (Form 9A); status of the documents</w:t>
       </w:r>
     </w:p>
     <w:p>
@@ -162,7 +162,29 @@
           <w:sz w:val="19"/>
           <w:szCs w:val="19"/>
         </w:rPr>
-        <w:t xml:space="preserve">The Appellant was an Administration Officer on the Logan Hospital Switchboard; the Respondent admits that maintaining accurate contact details for medical staff is a critical function of the Switchboard to ensure effective clinical handover and patient safety (fact 289). The Appellant applies for leave to file and serve the enclosed Second Amended Statement of Facts and Contentions (Form 9A), under section 451(2) of the Industrial Relations Act 2016. A copy goes to the Respondent with this letter, and its consent is sought. Since the Amended Form 9A of 7 April 2026, the Respondent has admitted, to the extent recorded in its response of 8 September 2026, 298 of the 303 facts in the Appellant's notice of 28 August 2026, and has admitted or since confirmed 29 of the 39 documents behind them. The amendment accepts that the onus of proof is on the Appellant, withdraws the descriptions of conduct used in the earlier pleading, and adds no new stressor or allegation. No hearing date has been set, so the amendment is sought before either party prepares for hearing on the earlier pleading. The Appellant does not oppose the Respondent having time to amend its own statement of facts and contentions.</w:t>
+        <w:t xml:space="preserve">The Appellant was an Administration Officer on the Logan Hospital Switchboard; the Respondent admits that maintaining accurate contact details for medical staff is a critical function of the Switchboard to ensure effective clinical handover and patient safety (fact 289). The Appellant applies for leave under section 451(2) of the Industrial Relations Act 2016 to file and serve the proposed Second Amended Statement of Facts and Contentions (Form 9A) enclosed for the Commission's consideration. A copy is provided to the Respondent with this letter and its consent is sought. Since the Amended Form 9A of 7 April 2026, the Respondent has admitted, to the extent recorded in its response of 8 September 2026, 298 of the 303 facts in the Appellant's notice of 28 August 2026, and has admitted or since confirmed 29 of the 39 documents behind them. The proposed amendment accepts that the onus of proof is on the Appellant, withdraws the descriptions of conduct used in the earlier pleading, and adds no new stressor or allegation. No hearing date has been set. The Appellant does not oppose the Respondent having time to amend its own statement of facts and contentions if leave is granted. The Appellant's list of witnesses filed, and outlines of evidence served, on 9 September 2026 are not amended and stand as filed and served.</w:t>
+      </w:r>
+    </w:p>
+    <w:p>
+      <w:pPr>
+        <w:spacing w:before="0" w:after="80" w:line="264" w:lineRule="auto"/>
+      </w:pPr>
+      <w:r>
+        <w:rPr>
+          <w:rFonts w:ascii="Arial" w:hAnsi="Arial" w:cs="Arial"/>
+          <w:b/>
+          <w:sz w:val="19"/>
+          <w:szCs w:val="19"/>
+        </w:rPr>
+        <w:t xml:space="preserve">How the proposed Form 9A is arranged. </w:t>
+      </w:r>
+      <w:r>
+        <w:rPr>
+          <w:rFonts w:ascii="Arial" w:hAnsi="Arial" w:cs="Arial"/>
+          <w:sz w:val="19"/>
+          <w:szCs w:val="19"/>
+        </w:rPr>
+        <w:t xml:space="preserve">Each of the three stressors is pleaded so that it can be read and assessed on its own facts. An admitted fact is repeated where necessary to keep each stressor's sequence complete and to show the different part it plays there; read together, the three stressors show the whole course of employment circumstances relied on. Under each stressor, the list of stressors identifies the individual events relied on as causes; the other particulars are context, or the employer's record of how the matters were handled. The treating records are used for what was recorded clinically about that course and its effect, not to prove a disputed workplace event.</w:t>
       </w:r>
     </w:p>
     <w:p>
@@ -206,7 +228,7 @@
           <w:sz w:val="19"/>
           <w:szCs w:val="19"/>
         </w:rPr>
-        <w:t>The notice to admit facts (303 facts), the notice to admit documents (39 documents at Annexure A) and the Respondent's responses of 8 September 2026 were served between the parties and are not on the Commission's file. They, and the documents themselves, are available to the Commission on request. If the Commission wishes to consider them with the enclosure, the Appellant will file them in the form the Registry directs, together with the four documents the Respondent confirmed on 23 September 2026.</w:t>
+        <w:t xml:space="preserve">The notices to admit, the Respondent's responses of 8 September 2026 and the underlying documents were served between the parties and are available to the Commission in the form the Registry directs.</w:t>
       </w:r>
     </w:p>
     <w:p>
@@ -228,27 +250,29 @@
           <w:sz w:val="19"/>
           <w:szCs w:val="19"/>
         </w:rPr>
-        <w:t xml:space="preserve">Part 1 of the schedule on the following pages states the status of each of the 39 documents at Annexure A to the notices of 28 August 2026; Part 2 lists the other documents the pleading relies on; Part 3 indexes the dated particulars of the Second Amended Form 9A and adds no stressor. The Appellant asks that the Respondent be directed to state, by a date the Commission fixes, whether it maintains its dispute as to the authenticity of each of the ten outstanding documents and, if so, on what ground; that any dispute not so maintained cease to be in issue, so that the document is taken to be authentic for the hearing, without affecting any question of relevance or weight; or that the Commission make such other order about authenticity as it considers appropriate.</w:t>
+        <w:t xml:space="preserve">Part 1 of the schedule on the following pages states the status of each of the 39 documents at Annexure A to the notices of 28 August 2026; Part 2 lists the other documents the pleading relies on; Part 3 indexes the dated particulars of the proposed Second Amended Form 9A and adds no stressor. The Appellant asks that the Respondent be directed, by a date fixed by the Commission, to state whether it maintains its dispute as to the authenticity of each of the ten outstanding documents and, for each dispute maintained, particularise the ground on which authenticity is disputed; that any dispute not so maintained cease to be in issue; and that the Appellant have liberty to apply in relation to any authenticity dispute remaining after that date. No direction as to relevance, weight or admissibility is presently sought.</w:t>
       </w:r>
     </w:p>
     <w:p>
       <w:pPr>
-        <w:keepNext/>
-        <w:spacing w:before="0" w:after="200" w:line="264" w:lineRule="auto"/>
+        <w:spacing w:before="0" w:after="80" w:line="264" w:lineRule="auto"/>
       </w:pPr>
+      <w:r>
+        <w:rPr>
+          <w:rFonts w:ascii="Arial" w:hAnsi="Arial" w:cs="Arial"/>
+          <w:b/>
+          <w:sz w:val="19"/>
+          <w:szCs w:val="19"/>
+        </w:rPr>
+        <w:t xml:space="preserve">Filing position. </w:t>
+      </w:r>
       <w:r>
         <w:rPr>
           <w:rFonts w:ascii="Arial" w:hAnsi="Arial" w:cs="Arial"/>
           <w:sz w:val="19"/>
           <w:szCs w:val="19"/>
         </w:rPr>
-        <w:t>The Appellant asks that this letter and its enclosure be placed before Commissioner Dwyer and will proceed on the orders made.</w:t>
-      </w:r>
-      <w:r>
-        <w:rPr>
-          <w:sz w:val="19"/>
-        </w:rPr>
-        <w:t xml:space="preserve"> The combined package exceeds 30 pages. In view of Practice Direction 3 of 2021, the Appellant seeks directions about providing hard copies or permission to file the complete package electronically.</w:t>
+        <w:t xml:space="preserve">The Appellant asks that the election and this letter be filed and placed before Commissioner Dwyer. The proposed Second Amended Form 9A is enclosed only for the Commission's consideration of the application for leave and is not presently submitted for filing. If leave is granted, the Appellant will supply a hard copy of the Form 9A to the Registry and will file and serve it in the form directed by the Commission or Registry.</w:t>
       </w:r>
     </w:p>
     <w:p>
@@ -262,7 +286,7 @@
           <w:sz w:val="19"/>
           <w:szCs w:val="19"/>
         </w:rPr>
-        <w:t>This letter accompanies the Appellant's election and requested directions. Enclosure: Second Amended Statement of Facts and Contentions (Form 9A).</w:t>
+        <w:t xml:space="preserve">This letter accompanies the Appellant's election and requested directions. Enclosure for consideration: proposed Second Amended Statement of Facts and Contentions (Form 9A).</w:t>
       </w:r>
     </w:p>
     <w:p>
@@ -356,7 +380,7 @@
           <w:sz w:val="19"/>
           <w:szCs w:val="19"/>
         </w:rPr>
-        <w:t>The 39 documents at Annexure A to the notices to admit served 28 August 2026 are the documents from which the facts in Part B of the Second Amended Form 9A are drawn. On 8 September 2026 the Respondent admitted the authenticity of 25 of them and disputed 14. By email of 23 September 2026 it confirmed four of the 14 "upon further review of the appeal file", stated that it had "requested copies of these documents to be disclosed from MSH" for nine others, and did not mention the fourteenth. The facts recorded in 13 of the 14 were admitted on 8 September 2026 to the extent set out in Part B; the exception is the register at Tab 31, from which facts 228 to 231 were not admitted. For the other 13, what remains in dispute is the authenticity of the copies, not their content.</w:t>
+        <w:t xml:space="preserve">The 39 documents at Annexure A to the notices to admit served 28 August 2026 are the documents from which the facts in Part B of the proposed Second Amended Form 9A are drawn. On 8 September 2026 the Respondent admitted the authenticity of 25 of them and disputed 14. By email of 24 September 2026 it confirmed four of the 14 "upon further review of the appeal file", stated that it had "requested copies of these documents to be disclosed from MSH" for nine others, and did not mention the fourteenth. The facts recorded in 13 of the 14 were admitted on 8 September 2026 to the extent set out in Part B; the exception is the register at Tab 31, from which facts 228 to 231 were not admitted. For the other 13, what remains in dispute is the authenticity of the copies, not their content.</w:t>
       </w:r>
     </w:p>
     <w:tbl>
@@ -510,7 +534,7 @@
                 <w:sz w:val="16"/>
                 <w:szCs w:val="16"/>
               </w:rPr>
-              <w:t xml:space="preserve">23 Sep 2026</w:t>
+              <w:t xml:space="preserve">24 Sep 2026</w:t>
             </w:r>
           </w:p>
         </w:tc>
@@ -6459,7 +6483,7 @@
           <w:sz w:val="19"/>
           <w:szCs w:val="19"/>
         </w:rPr>
-        <w:t>The Appellant asked the Respondent on 9 September 2026 to confirm the ten outstanding documents; the Respondent's email of 23 September 2026 gives no date by which the copies are expected. The copies of Tabs 1, 5, 17 to 19, 21 to 24 and 31 came from the Appellant's own records; Tabs 17 to 19, 22 and 23 bear the signature of the employer's Director, Corporate Services. Tab 24 is a Together Queensland document, which the email of 23 September 2026 does not address.</w:t>
+        <w:t xml:space="preserve">The Appellant asked the Respondent on 9 September 2026 to confirm the ten outstanding documents; the Respondent's email of 24 September 2026 gives no date by which the copies are expected. The copies of Tabs 1, 5, 17 to 19, 21 to 24 and 31 came from the Appellant's own records; Tabs 17 to 19, 22 and 23 bear the signature of the employer's Director, Corporate Services. Tab 24 is a Together Queensland document, which the email of 24 September 2026 does not address.</w:t>
       </w:r>
     </w:p>
     <w:p>
@@ -6474,7 +6498,7 @@
           <w:sz w:val="19"/>
           <w:szCs w:val="19"/>
         </w:rPr>
-        <w:t>Schedule, Part 2: other documents relied on in the Second Amended Form 9A that are not at Annexure A</w:t>
+        <w:t xml:space="preserve">Schedule, Part 2: other documents relied on in the proposed Second Amended Form 9A that are not at Annexure A</w:t>
       </w:r>
     </w:p>
     <w:tbl>
@@ -7279,7 +7303,7 @@
                 <w:color w:val="000000"/>
                 <w:sz w:val="18"/>
               </w:rPr>
-              <w:t>Stressor 3(b), the ordinary-call-load paragraph</w:t>
+              <w:t xml:space="preserve">Stressor 1, the operating conditions; Stressor 3(b), the ordinary-call-load paragraph</w:t>
             </w:r>
           </w:p>
         </w:tc>
@@ -7304,6 +7328,79 @@
                 <w:szCs w:val="16"/>
               </w:rPr>
               <w:t xml:space="preserve">The Appellant's own record and evidence (Part B preamble).</w:t>
+            </w:r>
+          </w:p>
+        </w:tc>
+      </w:tr>
+      <w:tr>
+        <w:trPr>
+          <w:cantSplit/>
+        </w:trPr>
+        <w:tc>
+          <w:tcPr>
+            <w:tcMar>
+              <w:top w:w="65" w:type="dxa"/>
+              <w:left w:w="80" w:type="dxa"/>
+              <w:bottom w:w="65" w:type="dxa"/>
+              <w:right w:w="80" w:type="dxa"/>
+            </w:tcMar>
+          </w:tcPr>
+          <w:p>
+            <w:pPr>
+              <w:spacing w:after="0"/>
+            </w:pPr>
+            <w:r>
+              <w:rPr>
+                <w:rFonts w:ascii="Arial" w:hAnsi="Arial" w:cs="Arial"/>
+                <w:color w:val="000000"/>
+                <w:sz w:val="16"/>
+                <w:szCs w:val="16"/>
+              </w:rPr>
+              <w:t xml:space="preserve">Queensland Health Fatigue Risk Management Systems Implementation Guideline QH-GDL-401-3.3:2021 (the full disclosed guideline)</w:t>
+            </w:r>
+          </w:p>
+        </w:tc>
+        <w:tc>
+          <w:tcPr>
+            <w:tcMar>
+              <w:top w:w="65" w:type="dxa"/>
+              <w:left w:w="80" w:type="dxa"/>
+              <w:bottom w:w="65" w:type="dxa"/>
+              <w:right w:w="80" w:type="dxa"/>
+            </w:tcMar>
+          </w:tcPr>
+          <w:p>
+            <w:r>
+              <w:rPr>
+                <w:rFonts w:ascii="Arial" w:hAnsi="Arial"/>
+                <w:color w:val="000000"/>
+                <w:sz w:val="18"/>
+              </w:rPr>
+              <w:t xml:space="preserve">Stressor 3(h) and the supporting fatigue records; the quotations from the guideline</w:t>
+            </w:r>
+          </w:p>
+        </w:tc>
+        <w:tc>
+          <w:tcPr>
+            <w:tcMar>
+              <w:top w:w="65" w:type="dxa"/>
+              <w:left w:w="80" w:type="dxa"/>
+              <w:bottom w:w="65" w:type="dxa"/>
+              <w:right w:w="80" w:type="dxa"/>
+            </w:tcMar>
+          </w:tcPr>
+          <w:p>
+            <w:pPr>
+              <w:spacing w:after="0"/>
+            </w:pPr>
+            <w:r>
+              <w:rPr>
+                <w:rFonts w:ascii="Arial" w:hAnsi="Arial" w:cs="Arial"/>
+                <w:color w:val="000000"/>
+                <w:sz w:val="16"/>
+                <w:szCs w:val="16"/>
+              </w:rPr>
+              <w:t xml:space="preserve">Disclosed in full with the 20 May 2024 email chain on 14 July 2025. Tab 8A at Annexure A is the cover page only.</w:t>
             </w:r>
           </w:p>
         </w:tc>
@@ -7332,7 +7429,7 @@
           <w:sz w:val="19"/>
           <w:szCs w:val="19"/>
         </w:rPr>
-        <w:t xml:space="preserve">Schedule, Part 3: index of the dated particulars in the Second Amended Form 9A (index only; not additional stressors). </w:t>
+        <w:t xml:space="preserve">Schedule, Part 3: index of the dated particulars in the proposed Second Amended Form 9A (index only; not additional stressors). </w:t>
       </w:r>
       <w:r>
         <w:rPr>
@@ -7340,7 +7437,7 @@
           <w:sz w:val="19"/>
           <w:szCs w:val="19"/>
         </w:rPr>
-        <w:t xml:space="preserve">The three stressors are pleaded, with their particulars, in the Second Amended Form 9A; this index adds no stressor or particular. The causal particulars are 1(b), 1(d), 1(f) to 1(h), 1(k) and 1(l); 2(a) to 2(i), 2(l) and 2(m); and 3(b) to 3(f); they are also listed, with their dates and descriptions, under each stressor in the list of stressors in the Second Amended Form 9A. Particulars 1(a), 1(c), 1(e), 1(i), 1(j), 2(j) and 3(a) are context. Particulars 2(k), 2(n), 2(o), 3(g) and 3(h) are the record of how the matters were handled and when the corrections were made; they are relied on as proof, not as separate causes.</w:t>
+        <w:t xml:space="preserve">The three stressors are pleaded, with their particulars, in the proposed Second Amended Form 9A; this index adds no stressor or particular. The causal particulars are 1(b), 1(d), 1(f) to 1(h), 1(k) and 1(l); 2(a) to 2(i), 2(l) and 2(m); and 3(b) to 3(f); they are also listed, with their dates and descriptions, under each stressor in the list of stressors in the proposed Second Amended Form 9A. Particulars 1(a), 1(c), 1(e), 1(i), 1(j), 2(j) and 3(a) are context. Particulars 2(k), 2(n), 2(o), 3(g) and 3(h) are the record of how the matters were handled and when the corrections were made; they are relied on as proof, not as separate causes.</w:t>
       </w:r>
     </w:p>
     <w:tbl>
@@ -9205,7 +9302,7 @@
                 <w:color w:val="000000"/>
                 <w:sz w:val="18"/>
               </w:rPr>
-              <w:t>Payroll later described the claim as submitted late.</w:t>
+              <w:t xml:space="preserve">Payroll later described the 30 March public holiday claim as submitted late; relied on as Payroll's later account, not as an admission.</w:t>
             </w:r>
           </w:p>
         </w:tc>

</xml_diff>

<commit_message>
WC/2024/227: election item 3 repaired; table compaction and selective bold (change 74)
Co-Authored-By: Claude Opus 5.5 <noreply@anthropic.com>
Claude-Session: https://claude.ai/code/session_01PbSZiMB1koFR46V5hQyVcy
</commit_message>
<xml_diff>
--- a/wc2024227/drafts/out/FILING_1OCT2026/2026-10_LETTER_to_Registry_FINAL.docx
+++ b/wc2024227/drafts/out/FILING_1OCT2026/2026-10_LETTER_to_Registry_FINAL.docx
@@ -162,7 +162,115 @@
           <w:sz w:val="19"/>
           <w:szCs w:val="19"/>
         </w:rPr>
-        <w:t xml:space="preserve">The Appellant was an Administration Officer on the Logan Hospital Switchboard; the Respondent admits that maintaining accurate contact details for medical staff is a critical function of the Switchboard to ensure effective clinical handover and patient safety (fact 289). The Appellant applies for leave under section 451(2) of the Industrial Relations Act 2016 to file and serve the proposed Second Amended Statement of Facts and Contentions (Form 9A) enclosed for the Commission's consideration. A copy is provided to the Respondent with this letter and its consent is sought. Since the Amended Form 9A of 7 April 2026, the Respondent has admitted, to the extent recorded in its response of 8 September 2026, 298 of the 303 facts in the Appellant's notice of 28 August 2026, and has admitted or since confirmed 29 of the 39 documents behind them. The amendment is sought because the facts have since been largely settled by those admissions. It reorganises the pleading around the admitted record rather than changing the case, so that the issues left for hearing are narrower: whether each circumstance was management action, whether any management action was reasonable and taken in a reasonable way, and causation. The proposed amendment accepts that the onus of proof is on the Appellant, withdraws the descriptions of conduct used in the earlier pleading, and adds no new stressor or allegation. No hearing date has been set. The Appellant does not oppose the Respondent having time to amend its own statement of facts and contentions if leave is granted. The Appellant's list of witnesses filed, and outlines of evidence served, on 9 September 2026 are not amended and stand as filed and served.</w:t>
+        <w:t xml:space="preserve">The Appellant was an Administration Officer on the Logan Hospital Switchboard; the Respondent admits that maintaining accurate contact details for medical staff is a critical function of the Switchboard to ensure effective clinical handover and patient safety (fact 289). The Appellant applies for leave under section 451(2) of the Industrial Relations Act 2016 to file and serve the proposed Second Amended Statement of Facts and Contentions (Form 9A) enclosed for the Commission's consideration. A copy is provided to the Respondent with this letter and its consent is sought. Since the Amended Form 9A of 7 April 2026, the Respondent has admitted, to the extent recorded in its response of 8 September 2026, </w:t>
+      </w:r>
+      <w:r>
+        <w:rPr>
+          <w:rFonts w:ascii="Arial" w:hAnsi="Arial" w:cs="Arial"/>
+          <w:b/>
+          <w:sz w:val="19"/>
+          <w:szCs w:val="19"/>
+        </w:rPr>
+        <w:t xml:space="preserve">298 of the 303 facts</w:t>
+      </w:r>
+      <w:r>
+        <w:rPr>
+          <w:rFonts w:ascii="Arial" w:hAnsi="Arial" w:cs="Arial"/>
+          <w:b w:val="0"/>
+          <w:sz w:val="19"/>
+          <w:szCs w:val="19"/>
+        </w:rPr>
+        <w:t xml:space="preserve"> in the Appellant's notice of 28 August 2026, and has admitted or since confirmed </w:t>
+      </w:r>
+      <w:r>
+        <w:rPr>
+          <w:rFonts w:ascii="Arial" w:hAnsi="Arial" w:cs="Arial"/>
+          <w:b/>
+          <w:sz w:val="19"/>
+          <w:szCs w:val="19"/>
+        </w:rPr>
+        <w:t xml:space="preserve">29 of the 39 documents</w:t>
+      </w:r>
+      <w:r>
+        <w:rPr>
+          <w:rFonts w:ascii="Arial" w:hAnsi="Arial" w:cs="Arial"/>
+          <w:b w:val="0"/>
+          <w:sz w:val="19"/>
+          <w:szCs w:val="19"/>
+        </w:rPr>
+        <w:t xml:space="preserve"> behind them. The amendment is sought because </w:t>
+      </w:r>
+      <w:r>
+        <w:rPr>
+          <w:rFonts w:ascii="Arial" w:hAnsi="Arial" w:cs="Arial"/>
+          <w:b/>
+          <w:sz w:val="19"/>
+          <w:szCs w:val="19"/>
+        </w:rPr>
+        <w:t xml:space="preserve">the facts have since been largely settled by those admissions</w:t>
+      </w:r>
+      <w:r>
+        <w:rPr>
+          <w:rFonts w:ascii="Arial" w:hAnsi="Arial" w:cs="Arial"/>
+          <w:b w:val="0"/>
+          <w:sz w:val="19"/>
+          <w:szCs w:val="19"/>
+        </w:rPr>
+        <w:t xml:space="preserve">. It reorganises the pleading around the admitted record rather than changing the case, so that the issues left for hearing are narrower: whether each circumstance was management action, whether any management action was reasonable and taken in a reasonable way, and causation. The proposed amendment accepts that </w:t>
+      </w:r>
+      <w:r>
+        <w:rPr>
+          <w:rFonts w:ascii="Arial" w:hAnsi="Arial" w:cs="Arial"/>
+          <w:b/>
+          <w:sz w:val="19"/>
+          <w:szCs w:val="19"/>
+        </w:rPr>
+        <w:t xml:space="preserve">the onus of proof is on the Appellant</w:t>
+      </w:r>
+      <w:r>
+        <w:rPr>
+          <w:rFonts w:ascii="Arial" w:hAnsi="Arial" w:cs="Arial"/>
+          <w:b w:val="0"/>
+          <w:sz w:val="19"/>
+          <w:szCs w:val="19"/>
+        </w:rPr>
+        <w:t xml:space="preserve">, withdraws the descriptions of conduct used in the earlier pleading, and </w:t>
+      </w:r>
+      <w:r>
+        <w:rPr>
+          <w:rFonts w:ascii="Arial" w:hAnsi="Arial" w:cs="Arial"/>
+          <w:b/>
+          <w:sz w:val="19"/>
+          <w:szCs w:val="19"/>
+        </w:rPr>
+        <w:t xml:space="preserve">adds no new stressor or allegation</w:t>
+      </w:r>
+      <w:r>
+        <w:rPr>
+          <w:rFonts w:ascii="Arial" w:hAnsi="Arial" w:cs="Arial"/>
+          <w:b w:val="0"/>
+          <w:sz w:val="19"/>
+          <w:szCs w:val="19"/>
+        </w:rPr>
+        <w:t xml:space="preserve">. </w:t>
+      </w:r>
+      <w:r>
+        <w:rPr>
+          <w:rFonts w:ascii="Arial" w:hAnsi="Arial" w:cs="Arial"/>
+          <w:b/>
+          <w:sz w:val="19"/>
+          <w:szCs w:val="19"/>
+        </w:rPr>
+        <w:t xml:space="preserve">No hearing date has been set</w:t>
+      </w:r>
+      <w:r>
+        <w:rPr>
+          <w:rFonts w:ascii="Arial" w:hAnsi="Arial" w:cs="Arial"/>
+          <w:b w:val="0"/>
+          <w:sz w:val="19"/>
+          <w:szCs w:val="19"/>
+        </w:rPr>
+        <w:t xml:space="preserve">. The Appellant does not oppose the Respondent having time to amend its own statement of facts and contentions if leave is granted. The Appellant's list of witnesses filed, and outlines of evidence served, on 9 September 2026 are not amended and stand as filed and served.</w:t>
       </w:r>
     </w:p>
     <w:p>
@@ -206,7 +314,92 @@
           <w:sz w:val="19"/>
           <w:szCs w:val="19"/>
         </w:rPr>
-        <w:t xml:space="preserve">(1) Its review decision of 24 October 2024 found that the Appellant sustained a personal injury of a psychological nature, arising out of employment to the extent it arose out of factors 2, 3 and 4, where employment was a significant contributing factor (facts 261 and 262); the claim was rejected under section 32(5). (2) Paragraph 27 of its amended statement of facts and contentions, which contends that any management action was reasonable management action taken in a reasonable way, does not identify the management action relied upon; that was admitted on 8 September 2026 (fact 303). That admission concerns paragraph 27; it does not dispose of the more specific explanations pleaded elsewhere in the Respondent's statement. (3) It has named no medical or expert witness and served no expert report: its list of 24 September 2026 names four witnesses, Ms Taylor, Ms Reese, Ms Wright and Ms Earl, described as "lay" witnesses, and it served outlines of their evidence. (4) Its outlines of evidence state that the seven-hour break of 17 to 18 March 2024 was "the result of human error" and, on the advice returned within payroll, "a rostering practice issue for the line manager"; and that the second decline of the paid Special Pandemic Leave request "appears to have been made in error". The Appellant asks that, at the opening of the conference, the Respondent be asked to state its position on paragraph 27 in light of those matters: whether it maintains it, will particularise it, or seeks time (items 2 and 5 of the election).</w:t>
+        <w:t xml:space="preserve">(1) Its review decision of 24 October 2024 found that the Appellant sustained a personal injury of a psychological nature, arising out of employment to the extent it arose out of factors 2, 3 and 4, where </w:t>
+      </w:r>
+      <w:r>
+        <w:rPr>
+          <w:rFonts w:ascii="Arial" w:hAnsi="Arial" w:cs="Arial"/>
+          <w:b/>
+          <w:sz w:val="19"/>
+          <w:szCs w:val="19"/>
+        </w:rPr>
+        <w:t xml:space="preserve">employment was a significant contributing factor</w:t>
+      </w:r>
+      <w:r>
+        <w:rPr>
+          <w:rFonts w:ascii="Arial" w:hAnsi="Arial" w:cs="Arial"/>
+          <w:sz w:val="19"/>
+          <w:szCs w:val="19"/>
+        </w:rPr>
+        <w:t xml:space="preserve"> (facts 261 and 262); the claim was rejected under section 32(5). (2) Paragraph 27 of its amended statement of facts and contentions, which contends that any management action was reasonable management action taken in a reasonable way, </w:t>
+      </w:r>
+      <w:r>
+        <w:rPr>
+          <w:rFonts w:ascii="Arial" w:hAnsi="Arial" w:cs="Arial"/>
+          <w:b/>
+          <w:sz w:val="19"/>
+          <w:szCs w:val="19"/>
+        </w:rPr>
+        <w:t xml:space="preserve">does not identify the management action relied upon</w:t>
+      </w:r>
+      <w:r>
+        <w:rPr>
+          <w:rFonts w:ascii="Arial" w:hAnsi="Arial" w:cs="Arial"/>
+          <w:sz w:val="19"/>
+          <w:szCs w:val="19"/>
+        </w:rPr>
+        <w:t xml:space="preserve">; that was admitted on 8 September 2026 (fact 303). That admission concerns paragraph 27; it does not dispose of the more specific explanations pleaded elsewhere in the Respondent's statement. (3) It has </w:t>
+      </w:r>
+      <w:r>
+        <w:rPr>
+          <w:rFonts w:ascii="Arial" w:hAnsi="Arial" w:cs="Arial"/>
+          <w:b/>
+          <w:sz w:val="19"/>
+          <w:szCs w:val="19"/>
+        </w:rPr>
+        <w:t xml:space="preserve">named no medical or expert witness and served no expert report</w:t>
+      </w:r>
+      <w:r>
+        <w:rPr>
+          <w:rFonts w:ascii="Arial" w:hAnsi="Arial" w:cs="Arial"/>
+          <w:sz w:val="19"/>
+          <w:szCs w:val="19"/>
+        </w:rPr>
+        <w:t xml:space="preserve">: its list of 24 September 2026 names four witnesses, Ms Taylor, Ms Reese, Ms Wright and Ms Earl, described as "lay" witnesses, and it served outlines of their evidence. (4) Its outlines of evidence state that the seven-hour break of 17 to 18 March 2024 was </w:t>
+      </w:r>
+      <w:r>
+        <w:rPr>
+          <w:rFonts w:ascii="Arial" w:hAnsi="Arial" w:cs="Arial"/>
+          <w:b/>
+          <w:sz w:val="19"/>
+          <w:szCs w:val="19"/>
+        </w:rPr>
+        <w:t xml:space="preserve">"the result of human error"</w:t>
+      </w:r>
+      <w:r>
+        <w:rPr>
+          <w:rFonts w:ascii="Arial" w:hAnsi="Arial" w:cs="Arial"/>
+          <w:sz w:val="19"/>
+          <w:szCs w:val="19"/>
+        </w:rPr>
+        <w:t xml:space="preserve"> and, on the advice returned within payroll, "a rostering practice issue for the line manager"; and that the second decline of the paid Special Pandemic Leave request </w:t>
+      </w:r>
+      <w:r>
+        <w:rPr>
+          <w:rFonts w:ascii="Arial" w:hAnsi="Arial" w:cs="Arial"/>
+          <w:b/>
+          <w:sz w:val="19"/>
+          <w:szCs w:val="19"/>
+        </w:rPr>
+        <w:t xml:space="preserve">"appears to have been made in error"</w:t>
+      </w:r>
+      <w:r>
+        <w:rPr>
+          <w:rFonts w:ascii="Arial" w:hAnsi="Arial" w:cs="Arial"/>
+          <w:sz w:val="19"/>
+          <w:szCs w:val="19"/>
+        </w:rPr>
+        <w:t xml:space="preserve">. The Appellant asks that, at the opening of the conference, the Respondent be asked to state its position on paragraph 27 in light of those matters: whether it maintains it, will particularise it, or seeks time (items 2 and 5 of the election).</w:t>
       </w:r>
     </w:p>
     <w:p>
@@ -272,7 +465,24 @@
           <w:sz w:val="19"/>
           <w:szCs w:val="19"/>
         </w:rPr>
-        <w:t xml:space="preserve">The Appellant asks that the election and this letter be filed and placed before Commissioner Dwyer. The proposed Second Amended Form 9A is enclosed only for the Commission's consideration of the application for leave and is not presently submitted for filing. If leave is granted, the Appellant will supply a hard copy of the Form 9A to the Registry and will file and serve it in the form directed by the Commission or Registry.</w:t>
+        <w:t xml:space="preserve">The Appellant asks that the election and this letter be filed and placed before Commissioner Dwyer. The proposed Second Amended Form 9A is enclosed only for the Commission's consideration of the application for leave and is </w:t>
+      </w:r>
+      <w:r>
+        <w:rPr>
+          <w:rFonts w:ascii="Arial" w:hAnsi="Arial" w:cs="Arial"/>
+          <w:b/>
+          <w:sz w:val="19"/>
+          <w:szCs w:val="19"/>
+        </w:rPr>
+        <w:t xml:space="preserve">not presently submitted for filing</w:t>
+      </w:r>
+      <w:r>
+        <w:rPr>
+          <w:rFonts w:ascii="Arial" w:hAnsi="Arial" w:cs="Arial"/>
+          <w:sz w:val="19"/>
+          <w:szCs w:val="19"/>
+        </w:rPr>
+        <w:t xml:space="preserve">. If leave is granted, the Appellant will supply a hard copy of the Form 9A to the Registry and will file and serve it in the form directed by the Commission or Registry.</w:t>
       </w:r>
     </w:p>
     <w:p>

</xml_diff>

<commit_message>
WC/2024/227: Stressor 1 - outlines' silence in letter; Hawes causation link in 9A; final readiness check (change 77)
Co-Authored-By: Claude Opus 5.5 <noreply@anthropic.com>
Claude-Session: https://claude.ai/code/session_01PbSZiMB1koFR46V5hQyVcy
</commit_message>
<xml_diff>
--- a/wc2024227/drafts/out/FILING_1OCT2026/2026-10_LETTER_to_Registry_FINAL.docx
+++ b/wc2024227/drafts/out/FILING_1OCT2026/2026-10_LETTER_to_Registry_FINAL.docx
@@ -448,7 +448,24 @@
           <w:sz w:val="22"/>
           <w:szCs w:val="22"/>
         </w:rPr>
-        <w:t xml:space="preserve">. The Appellant asks that, at the opening of the conference, the Respondent be asked to state its position on paragraph 27 in light of those matters: whether it maintains it, will particularise it, or seeks time (items 2 and 5 of the election).</w:t>
+        <w:t xml:space="preserve">. </w:t>
+      </w:r>
+      <w:r>
+        <w:rPr>
+          <w:rFonts w:ascii="Times New Roman" w:hAnsi="Times New Roman" w:cs="Times New Roman"/>
+          <w:b/>
+          <w:sz w:val="22"/>
+          <w:szCs w:val="22"/>
+        </w:rPr>
+        <w:t xml:space="preserve">Its outlines give no account of the dated events at Stressor 1(b), 1(f), 1(h) and 1(k)</w:t>
+      </w:r>
+      <w:r>
+        <w:rPr>
+          <w:rFonts w:ascii="Times New Roman" w:hAnsi="Times New Roman" w:cs="Times New Roman"/>
+          <w:sz w:val="22"/>
+          <w:szCs w:val="22"/>
+        </w:rPr>
+        <w:t xml:space="preserve">: the removal of database access, the 15 April 2024 process change, the misdirected calls, and the directory error reported by the Integrated Respiratory Service. The Appellant asks that, at the opening of the conference, the Respondent be asked to state its position on paragraph 27 in light of those matters: whether it maintains it, will particularise it, or seeks time (items 2 and 5 of the election).</w:t>
       </w:r>
     </w:p>
     <w:p>

</xml_diff>

<commit_message>
WC/2024/227: letter - how the admitted facts are relied on, and the test is for the Commission (change 79)
Co-Authored-By: Claude Opus 5.5 <noreply@anthropic.com>
Claude-Session: https://claude.ai/code/session_01PbSZiMB1koFR46V5hQyVcy
</commit_message>
<xml_diff>
--- a/wc2024227/drafts/out/FILING_1OCT2026/2026-10_LETTER_to_Registry_FINAL.docx
+++ b/wc2024227/drafts/out/FILING_1OCT2026/2026-10_LETTER_to_Registry_FINAL.docx
@@ -340,7 +340,30 @@
           <w:sz w:val="22"/>
           <w:szCs w:val="22"/>
         </w:rPr>
-        <w:t xml:space="preserve">The matter is largely documentary: the directions, rosters, pay claims, requests and replies relied on were made in writing, by email, roster, myHR and payroll record. As stated in the Appellant's letter to the Respondent of 9 September 2026, where the document is itself the step taken, the admission is relied on as establishing that the step was taken on the date and in the terms recorded. The proposed Form 9A therefore sets out each such document with its date and terms, which accounts for its length. Each of the three stressors is pleaded so that it can be read and assessed on its own facts. An admitted fact is repeated where necessary to keep each stressor's sequence complete and to show the different part it plays there; read together, the three stressors show the whole course of employment circumstances relied on. Under each stressor, the list of stressors identifies the individual events relied on as causes; the other particulars are context, or the employer's record of how the matters were handled. The treating records are used for what was recorded clinically about that course and its effect, not to prove a disputed workplace event.</w:t>
+        <w:t xml:space="preserve">The matter is largely documentary: the directions, rosters, pay claims, requests and replies relied on were made in writing, by email, roster, myHR and payroll record. The proposed Form 9A therefore sets out each such document with its date and terms, which accounts for its length. Each of the three stressors is pleaded so that it can be read and assessed on its own facts. An admitted fact is repeated where necessary to keep each stressor's sequence complete and to show the different part it plays there; read together, the three stressors show the whole course of employment circumstances relied on. Under each stressor, the list of stressors identifies the individual events relied on as causes; the other particulars are context, or the employer's record of how the matters were handled. The treating records are used for what was recorded clinically about that course and its effect, not to prove a disputed workplace event.</w:t>
+      </w:r>
+    </w:p>
+    <w:p>
+      <w:pPr>
+        <w:spacing w:before="0" w:after="80" w:line="264" w:lineRule="auto"/>
+        <w:jc w:val="both"/>
+      </w:pPr>
+      <w:r>
+        <w:rPr>
+          <w:rFonts w:ascii="Times New Roman" w:hAnsi="Times New Roman" w:cs="Times New Roman"/>
+          <w:b/>
+          <w:sz w:val="22"/>
+          <w:szCs w:val="22"/>
+        </w:rPr>
+        <w:t xml:space="preserve">How the admitted facts are relied on. </w:t>
+      </w:r>
+      <w:r>
+        <w:rPr>
+          <w:rFonts w:ascii="Times New Roman" w:hAnsi="Times New Roman" w:cs="Times New Roman"/>
+          <w:sz w:val="22"/>
+          <w:szCs w:val="22"/>
+        </w:rPr>
+        <w:t xml:space="preserve">As stated in the Appellant's letter to the Respondent of 9 September 2026: the admissions are made for this proceeding only, under rule 49 of the Industrial Relations (Tribunals) Rules 2011, and relevance, admissibility and weight are for the Commission. Where an admitted document is itself the step taken - a directive issued by email, a roster as published, a payroll instruction or claim as recorded, a request as made and the reply as given - the admission is relied on as establishing that the step was taken on the date and in the terms recorded, and no characterisation, conclusion or inference is drawn from it beyond the fact admitted. Where an admitted document records the statement or opinion of another person, such as the treating practitioners' records or Review Decision 69983, it is relied on for its existence and wording; the treating practitioners will be called, and the review decision is relied on as the Regulator's own review, not as binding the Commission. Whether each event was management action, whether any management action was reasonable and taken in a reasonable way, and whether it contributed to the injury, are for the Commission to decide by applying the statutory test to those events.</w:t>
       </w:r>
     </w:p>
     <w:p>

</xml_diff>

<commit_message>
WC/2024/227: letter - what is relied on and admitted, and what the hearing member decides (change 80)
Co-Authored-By: Claude Opus 5.5 <noreply@anthropic.com>
Claude-Session: https://claude.ai/code/session_01PbSZiMB1koFR46V5hQyVcy
</commit_message>
<xml_diff>
--- a/wc2024227/drafts/out/FILING_1OCT2026/2026-10_LETTER_to_Registry_FINAL.docx
+++ b/wc2024227/drafts/out/FILING_1OCT2026/2026-10_LETTER_to_Registry_FINAL.docx
@@ -355,7 +355,7 @@
           <w:sz w:val="22"/>
           <w:szCs w:val="22"/>
         </w:rPr>
-        <w:t xml:space="preserve">How the admitted facts are relied on. </w:t>
+        <w:t xml:space="preserve">What is relied on, and what is admitted. </w:t>
       </w:r>
       <w:r>
         <w:rPr>
@@ -363,7 +363,7 @@
           <w:sz w:val="22"/>
           <w:szCs w:val="22"/>
         </w:rPr>
-        <w:t xml:space="preserve">As stated in the Appellant's letter to the Respondent of 9 September 2026: the admissions are made for this proceeding only, under rule 49 of the Industrial Relations (Tribunals) Rules 2011, and relevance, admissibility and weight are for the Commission. Where an admitted document is itself the step taken - a directive issued by email, a roster as published, a payroll instruction or claim as recorded, a request as made and the reply as given - the admission is relied on as establishing that the step was taken on the date and in the terms recorded, and no characterisation, conclusion or inference is drawn from it beyond the fact admitted. Where an admitted document records the statement or opinion of another person, such as the treating practitioners' records or Review Decision 69983, it is relied on for its existence and wording; the treating practitioners will be called, and the review decision is relied on as the Regulator's own review, not as binding the Commission. Whether each event was management action, whether any management action was reasonable and taken in a reasonable way, and whether it contributed to the injury, are for the Commission to decide by applying the statutory test to those events.</w:t>
+        <w:t xml:space="preserve">The proposed Form 9A relies on the facts admitted by the Respondent on 8 September 2026, each marked with its paragraph number in square brackets; the documents at Annexure A, 29 of which are admitted or since confirmed (Schedule, Part 1); the other documents in Part 2 of the schedule; the treating practitioners' records, with their oral evidence; and the Appellant's own evidence, which carries no bracket. The dated events pleaded as causes are therefore admitted, to the extent recorded in the Respondent's response, except where the proposed Form 9A marks otherwise: the register at Tab 31 (facts 228 to 231, not admitted), Payroll's later account at 2(e), and the Appellant's own evidence. What remains is for the hearing member to decide on that record: whether each event was management action, whether any management action was reasonable and taken in a reasonable way, and whether employment was a significant contributing factor to the injury, on the evidence of the treating practitioners.</w:t>
       </w:r>
     </w:p>
     <w:p>

</xml_diff>

<commit_message>
WC/2024/227: letter - witness list and outlines stand as filed and served 9 Sep 2026, in bold (change 83)
Co-Authored-By: Claude Opus 5.5 <noreply@anthropic.com>
Claude-Session: https://claude.ai/code/session_01PbSZiMB1koFR46V5hQyVcy
</commit_message>
<xml_diff>
--- a/wc2024227/drafts/out/FILING_1OCT2026/2026-10_LETTER_to_Registry_FINAL.docx
+++ b/wc2024227/drafts/out/FILING_1OCT2026/2026-10_LETTER_to_Registry_FINAL.docx
@@ -317,7 +317,16 @@
           <w:sz w:val="22"/>
           <w:szCs w:val="22"/>
         </w:rPr>
-        <w:t xml:space="preserve">. The Appellant does not oppose the Respondent having time to amend its own statement of facts and contentions if leave is granted. The Appellant's list of witnesses filed, and outlines of evidence served, on 9 September 2026 are not amended and stand as filed and served.</w:t>
+        <w:t xml:space="preserve">. The Appellant does not oppose the Respondent having time to amend its own statement of facts and contentions if leave is granted. </w:t>
+      </w:r>
+      <w:r>
+        <w:rPr>
+          <w:rFonts w:ascii="Times New Roman" w:hAnsi="Times New Roman" w:cs="Times New Roman"/>
+          <w:b/>
+          <w:sz w:val="22"/>
+          <w:szCs w:val="22"/>
+        </w:rPr>
+        <w:t xml:space="preserve">The Appellant's list of witnesses, filed in the Industrial Registry on 9 September 2026 under direction 1, and his outlines of evidence, served on the Respondent on 9 September 2026 under direction 2, are not amended and stand as filed and served on that date.</w:t>
       </w:r>
     </w:p>
     <w:p>

</xml_diff>